<commit_message>
docs: correct proposal member role assignments
</commit_message>
<xml_diff>
--- a/CampusLoop_Project_Proposal_Submission.docx
+++ b/CampusLoop_Project_Proposal_Submission.docx
@@ -2758,7 +2758,7 @@
                 <w:rFonts w:ascii="Times New Roman" w:hAnsi="Times New Roman" w:eastAsia="Times New Roman"/>
                 <w:sz w:val="24"/>
               </w:rPr>
-              <w:t>M2 - Chen Zihong</w:t>
+              <w:t>M2 - Ma Xuan</w:t>
             </w:r>
           </w:p>
         </w:tc>
@@ -2839,7 +2839,7 @@
                 <w:rFonts w:ascii="Times New Roman" w:hAnsi="Times New Roman" w:eastAsia="Times New Roman"/>
                 <w:sz w:val="24"/>
               </w:rPr>
-              <w:t>M3 - Gao Junjie</w:t>
+              <w:t>M3 - Chen Hongqing</w:t>
             </w:r>
           </w:p>
         </w:tc>
@@ -2920,7 +2920,7 @@
                 <w:rFonts w:ascii="Times New Roman" w:hAnsi="Times New Roman" w:eastAsia="Times New Roman"/>
                 <w:sz w:val="24"/>
               </w:rPr>
-              <w:t>M4 - Hu Keming</w:t>
+              <w:t>M4 - Ye Zidan</w:t>
             </w:r>
           </w:p>
         </w:tc>
@@ -3001,7 +3001,7 @@
                 <w:rFonts w:ascii="Times New Roman" w:hAnsi="Times New Roman" w:eastAsia="Times New Roman"/>
                 <w:sz w:val="24"/>
               </w:rPr>
-              <w:t>M5 - Li Mingyuan</w:t>
+              <w:t>M5 - Hu Keming</w:t>
             </w:r>
           </w:p>
         </w:tc>
@@ -3242,7 +3242,7 @@
                 <w:rFonts w:ascii="Times New Roman" w:hAnsi="Times New Roman" w:eastAsia="Times New Roman"/>
                 <w:sz w:val="24"/>
               </w:rPr>
-              <w:t>M6 - Ma Xuan</w:t>
+              <w:t>M6 - Li Mingyuan</w:t>
             </w:r>
           </w:p>
         </w:tc>
@@ -3323,7 +3323,7 @@
                 <w:rFonts w:ascii="Times New Roman" w:hAnsi="Times New Roman" w:eastAsia="Times New Roman"/>
                 <w:sz w:val="24"/>
               </w:rPr>
-              <w:t>M7 - Chen Hongqing</w:t>
+              <w:t>M7 - Luo Kangrui</w:t>
             </w:r>
           </w:p>
         </w:tc>
@@ -3404,7 +3404,7 @@
                 <w:rFonts w:ascii="Times New Roman" w:hAnsi="Times New Roman" w:eastAsia="Times New Roman"/>
                 <w:sz w:val="24"/>
               </w:rPr>
-              <w:t>M8 - Luo Kangrui</w:t>
+              <w:t>M8 - Liang Jiawen</w:t>
             </w:r>
           </w:p>
         </w:tc>
@@ -3485,7 +3485,7 @@
                 <w:rFonts w:ascii="Times New Roman" w:hAnsi="Times New Roman" w:eastAsia="Times New Roman"/>
                 <w:sz w:val="24"/>
               </w:rPr>
-              <w:t>M9 - Liang Jiawen</w:t>
+              <w:t>M9 - Gao Junjie</w:t>
             </w:r>
           </w:p>
         </w:tc>
@@ -3566,7 +3566,7 @@
                 <w:rFonts w:ascii="Times New Roman" w:hAnsi="Times New Roman" w:eastAsia="Times New Roman"/>
                 <w:sz w:val="24"/>
               </w:rPr>
-              <w:t>M10 - Ye Zidan</w:t>
+              <w:t>M10 - Chen Zihong</w:t>
             </w:r>
           </w:p>
         </w:tc>

</xml_diff>